<commit_message>
Higher quality docs images
</commit_message>
<xml_diff>
--- a/docs/tehnička_dokumentacija/Tehnička dokumentacija.docx
+++ b/docs/tehnička_dokumentacija/Tehnička dokumentacija.docx
@@ -2726,10 +2726,11 @@
             </w:pPr>
             <w:r>
               <w:rPr>
+                <w:noProof/>
                 <w:lang w:val="hr-HR"/>
               </w:rPr>
               <w:drawing>
-                <wp:inline distT="0" distB="0" distL="0" distR="0" wp14:anchorId="3D60FBB4" wp14:editId="4CA50022">
+                <wp:inline distT="0" distB="0" distL="0" distR="0" wp14:anchorId="3D60FBB4" wp14:editId="0FC8F7E6">
                   <wp:extent cx="1800000" cy="1800000"/>
                   <wp:effectExtent l="0" t="0" r="0" b="0"/>
                   <wp:docPr id="1920218714" name="Picture 1"/>
@@ -2858,10 +2859,11 @@
             </w:pPr>
             <w:r>
               <w:rPr>
+                <w:noProof/>
                 <w:lang w:val="hr-HR"/>
               </w:rPr>
               <w:drawing>
-                <wp:inline distT="0" distB="0" distL="0" distR="0" wp14:anchorId="22A2449B" wp14:editId="462EB138">
+                <wp:inline distT="0" distB="0" distL="0" distR="0" wp14:anchorId="22A2449B" wp14:editId="51323FDE">
                   <wp:extent cx="1800000" cy="1800000"/>
                   <wp:effectExtent l="0" t="0" r="0" b="0"/>
                   <wp:docPr id="1923138967" name="Picture 1"/>
@@ -2968,10 +2970,11 @@
             </w:pPr>
             <w:r>
               <w:rPr>
+                <w:noProof/>
                 <w:lang w:val="hr-HR"/>
               </w:rPr>
               <w:drawing>
-                <wp:inline distT="0" distB="0" distL="0" distR="0" wp14:anchorId="0025C637" wp14:editId="4431DA23">
+                <wp:inline distT="0" distB="0" distL="0" distR="0" wp14:anchorId="0025C637" wp14:editId="6FE8CDF6">
                   <wp:extent cx="1800000" cy="1800000"/>
                   <wp:effectExtent l="0" t="0" r="0" b="0"/>
                   <wp:docPr id="683974906" name="Picture 1"/>
@@ -3079,10 +3082,11 @@
             </w:pPr>
             <w:r>
               <w:rPr>
+                <w:noProof/>
                 <w:lang w:val="hr-HR"/>
               </w:rPr>
               <w:drawing>
-                <wp:inline distT="0" distB="0" distL="0" distR="0" wp14:anchorId="3EC9A6DF" wp14:editId="591388F6">
+                <wp:inline distT="0" distB="0" distL="0" distR="0" wp14:anchorId="3EC9A6DF" wp14:editId="6297AD86">
                   <wp:extent cx="1800000" cy="1800000"/>
                   <wp:effectExtent l="0" t="0" r="0" b="0"/>
                   <wp:docPr id="650058983" name="Picture 1"/>
@@ -5017,8 +5021,8 @@
         <w:tblLook w:val="04A0" w:firstRow="1" w:lastRow="0" w:firstColumn="1" w:lastColumn="0" w:noHBand="0" w:noVBand="1"/>
       </w:tblPr>
       <w:tblGrid>
-        <w:gridCol w:w="6917"/>
-        <w:gridCol w:w="2443"/>
+        <w:gridCol w:w="6967"/>
+        <w:gridCol w:w="2393"/>
       </w:tblGrid>
       <w:tr>
         <w:tc>
@@ -5042,12 +5046,13 @@
             </w:pPr>
             <w:r>
               <w:rPr>
+                <w:noProof/>
                 <w:lang w:val="hr-HR"/>
               </w:rPr>
               <w:drawing>
-                <wp:inline distT="0" distB="0" distL="0" distR="0" wp14:anchorId="47E5F327" wp14:editId="1E89A09E">
-                  <wp:extent cx="3625581" cy="1371600"/>
-                  <wp:effectExtent l="0" t="0" r="0" b="0"/>
+                <wp:inline distT="0" distB="0" distL="0" distR="0" wp14:anchorId="47E5F327" wp14:editId="635C2F83">
+                  <wp:extent cx="3596014" cy="1393343"/>
+                  <wp:effectExtent l="0" t="0" r="4445" b="0"/>
                   <wp:docPr id="10046689" name="Picture 1"/>
                   <wp:cNvGraphicFramePr>
                     <a:graphicFrameLocks xmlns:a="http://schemas.openxmlformats.org/drawingml/2006/main" noChangeAspect="1"/>
@@ -5056,11 +5061,17 @@
                     <a:graphicData uri="http://schemas.openxmlformats.org/drawingml/2006/picture">
                       <pic:pic xmlns:pic="http://schemas.openxmlformats.org/drawingml/2006/picture">
                         <pic:nvPicPr>
-                          <pic:cNvPr id="10046689" name=""/>
+                          <pic:cNvPr id="10046689" name="Picture 1"/>
                           <pic:cNvPicPr/>
                         </pic:nvPicPr>
                         <pic:blipFill>
-                          <a:blip r:embed="rId16"/>
+                          <a:blip r:embed="rId16" cstate="print">
+                            <a:extLst>
+                              <a:ext uri="{28A0092B-C50C-407E-A947-70E740481C1C}">
+                                <a14:useLocalDpi xmlns:a14="http://schemas.microsoft.com/office/drawing/2010/main" val="0"/>
+                              </a:ext>
+                            </a:extLst>
+                          </a:blip>
                           <a:stretch>
                             <a:fillRect/>
                           </a:stretch>
@@ -5068,7 +5079,7 @@
                         <pic:spPr>
                           <a:xfrm>
                             <a:off x="0" y="0"/>
-                            <a:ext cx="3683054" cy="1393343"/>
+                            <a:ext cx="3596014" cy="1393343"/>
                           </a:xfrm>
                           <a:prstGeom prst="rect">
                             <a:avLst/>
@@ -5275,12 +5286,13 @@
             </w:pPr>
             <w:r>
               <w:rPr>
+                <w:noProof/>
                 <w:lang w:val="hr-HR"/>
               </w:rPr>
               <w:drawing>
-                <wp:inline distT="0" distB="0" distL="0" distR="0" wp14:anchorId="69B3BF0C" wp14:editId="0F0985A2">
-                  <wp:extent cx="2760453" cy="1357222"/>
-                  <wp:effectExtent l="0" t="0" r="1905" b="0"/>
+                <wp:inline distT="0" distB="0" distL="0" distR="0" wp14:anchorId="69B3BF0C" wp14:editId="3AE7A2C5">
+                  <wp:extent cx="2817255" cy="1311200"/>
+                  <wp:effectExtent l="0" t="0" r="2540" b="3810"/>
                   <wp:docPr id="1534686489" name="Picture 1"/>
                   <wp:cNvGraphicFramePr>
                     <a:graphicFrameLocks xmlns:a="http://schemas.openxmlformats.org/drawingml/2006/main" noChangeAspect="1"/>
@@ -5289,11 +5301,17 @@
                     <a:graphicData uri="http://schemas.openxmlformats.org/drawingml/2006/picture">
                       <pic:pic xmlns:pic="http://schemas.openxmlformats.org/drawingml/2006/picture">
                         <pic:nvPicPr>
-                          <pic:cNvPr id="1534686489" name=""/>
+                          <pic:cNvPr id="1534686489" name="Picture 1"/>
                           <pic:cNvPicPr/>
                         </pic:nvPicPr>
                         <pic:blipFill>
-                          <a:blip r:embed="rId18"/>
+                          <a:blip r:embed="rId18" cstate="print">
+                            <a:extLst>
+                              <a:ext uri="{28A0092B-C50C-407E-A947-70E740481C1C}">
+                                <a14:useLocalDpi xmlns:a14="http://schemas.microsoft.com/office/drawing/2010/main" val="0"/>
+                              </a:ext>
+                            </a:extLst>
+                          </a:blip>
                           <a:stretch>
                             <a:fillRect/>
                           </a:stretch>
@@ -5301,7 +5319,7 @@
                         <pic:spPr>
                           <a:xfrm>
                             <a:off x="0" y="0"/>
-                            <a:ext cx="2817255" cy="1385150"/>
+                            <a:ext cx="2817255" cy="1311200"/>
                           </a:xfrm>
                           <a:prstGeom prst="rect">
                             <a:avLst/>
@@ -5481,12 +5499,13 @@
             </w:pPr>
             <w:r>
               <w:rPr>
+                <w:noProof/>
                 <w:lang w:val="hr-HR"/>
               </w:rPr>
               <w:drawing>
-                <wp:inline distT="0" distB="0" distL="0" distR="0" wp14:anchorId="3F654F47" wp14:editId="7405F410">
-                  <wp:extent cx="4333136" cy="966159"/>
-                  <wp:effectExtent l="0" t="0" r="0" b="5715"/>
+                <wp:inline distT="0" distB="0" distL="0" distR="0" wp14:anchorId="3F654F47" wp14:editId="76411C4D">
+                  <wp:extent cx="4465077" cy="890444"/>
+                  <wp:effectExtent l="0" t="0" r="0" b="5080"/>
                   <wp:docPr id="458742070" name="Picture 1"/>
                   <wp:cNvGraphicFramePr>
                     <a:graphicFrameLocks xmlns:a="http://schemas.openxmlformats.org/drawingml/2006/main" noChangeAspect="1"/>
@@ -5495,11 +5514,17 @@
                     <a:graphicData uri="http://schemas.openxmlformats.org/drawingml/2006/picture">
                       <pic:pic xmlns:pic="http://schemas.openxmlformats.org/drawingml/2006/picture">
                         <pic:nvPicPr>
-                          <pic:cNvPr id="458742070" name=""/>
+                          <pic:cNvPr id="458742070" name="Picture 1"/>
                           <pic:cNvPicPr/>
                         </pic:nvPicPr>
                         <pic:blipFill>
-                          <a:blip r:embed="rId20"/>
+                          <a:blip r:embed="rId20" cstate="print">
+                            <a:extLst>
+                              <a:ext uri="{28A0092B-C50C-407E-A947-70E740481C1C}">
+                                <a14:useLocalDpi xmlns:a14="http://schemas.microsoft.com/office/drawing/2010/main" val="0"/>
+                              </a:ext>
+                            </a:extLst>
+                          </a:blip>
                           <a:stretch>
                             <a:fillRect/>
                           </a:stretch>
@@ -5507,7 +5532,7 @@
                         <pic:spPr>
                           <a:xfrm>
                             <a:off x="0" y="0"/>
-                            <a:ext cx="4465077" cy="995578"/>
+                            <a:ext cx="4465077" cy="890444"/>
                           </a:xfrm>
                           <a:prstGeom prst="rect">
                             <a:avLst/>
@@ -5690,12 +5715,13 @@
             </w:pPr>
             <w:r>
               <w:rPr>
+                <w:noProof/>
                 <w:lang w:val="hr-HR"/>
               </w:rPr>
               <w:drawing>
-                <wp:inline distT="0" distB="0" distL="0" distR="0" wp14:anchorId="256B6FE4" wp14:editId="4BE51881">
-                  <wp:extent cx="4266916" cy="1233577"/>
-                  <wp:effectExtent l="0" t="0" r="635" b="5080"/>
+                <wp:inline distT="0" distB="0" distL="0" distR="0" wp14:anchorId="256B6FE4" wp14:editId="4B682ADC">
+                  <wp:extent cx="4344731" cy="1153413"/>
+                  <wp:effectExtent l="0" t="0" r="9525" b="8890"/>
                   <wp:docPr id="395081490" name="Picture 1"/>
                   <wp:cNvGraphicFramePr>
                     <a:graphicFrameLocks xmlns:a="http://schemas.openxmlformats.org/drawingml/2006/main" noChangeAspect="1"/>
@@ -5704,11 +5730,17 @@
                     <a:graphicData uri="http://schemas.openxmlformats.org/drawingml/2006/picture">
                       <pic:pic xmlns:pic="http://schemas.openxmlformats.org/drawingml/2006/picture">
                         <pic:nvPicPr>
-                          <pic:cNvPr id="395081490" name=""/>
+                          <pic:cNvPr id="395081490" name="Picture 1"/>
                           <pic:cNvPicPr/>
                         </pic:nvPicPr>
                         <pic:blipFill>
-                          <a:blip r:embed="rId22"/>
+                          <a:blip r:embed="rId22" cstate="print">
+                            <a:extLst>
+                              <a:ext uri="{28A0092B-C50C-407E-A947-70E740481C1C}">
+                                <a14:useLocalDpi xmlns:a14="http://schemas.microsoft.com/office/drawing/2010/main" val="0"/>
+                              </a:ext>
+                            </a:extLst>
+                          </a:blip>
                           <a:stretch>
                             <a:fillRect/>
                           </a:stretch>
@@ -5716,7 +5748,7 @@
                         <pic:spPr>
                           <a:xfrm>
                             <a:off x="0" y="0"/>
-                            <a:ext cx="4344731" cy="1256073"/>
+                            <a:ext cx="4344731" cy="1153413"/>
                           </a:xfrm>
                           <a:prstGeom prst="rect">
                             <a:avLst/>
@@ -6487,6 +6519,7 @@
       </w:pPr>
       <w:r>
         <w:rPr>
+          <w:noProof/>
           <w:lang w:val="hr-HR"/>
         </w:rPr>
         <w:drawing>

</xml_diff>